<commit_message>
docs: switch Proximate domain to proximate.kuja.org (Idiris's decision)
Co-Authored-By: Claude Fable 5 <noreply@anthropic.com>
</commit_message>
<xml_diff>
--- a/docs/Proximate_Domain_Go_Live_2026-07-16.docx
+++ b/docs/Proximate_Domain_Go_Live_2026-07-16.docx
@@ -46,7 +46,7 @@
         <w:spacing w:after="80"/>
       </w:pPr>
       <w:r>
-        <w:t>Proximate will get its own web address: proximate.adesoafrica.org. Visitors to that address land directly on the Proximate-branded login (Arabic-first) and see only Proximate data — no tenant switcher, no shared URL. The platform has supported this since the tenant was created; today the domain was registered on our hosting (Railway), so the only remaining step is two DNS records at the adesoafrica.org DNS provider. While setting this up we also found and fixed a real problem: the platform’s scheduled automation had been failing silently every day.</w:t>
+        <w:t>Proximate will get its own web address: proximate.kuja.org. Visitors to that address land directly on the Proximate-branded login (Arabic-first) and see only Proximate data — no tenant switcher, no shared URL. The platform has supported this since the tenant was created; today the domain was registered on our hosting (Railway), so the only remaining step is two DNS records at the kuja.org DNS provider. While setting this up we also found and fixed a real problem: the platform’s scheduled automation had been failing silently every day.</w:t>
       </w:r>
     </w:p>
     <w:p>
@@ -59,7 +59,7 @@
           <w:color w:val="C2410C"/>
           <w:sz w:val="26"/>
         </w:rPr>
-        <w:t>Step 1 — Add two DNS records (IT / whoever manages adesoafrica.org)</w:t>
+        <w:t>Step 1 — Add two DNS records (the team managing kuja.org DNS)</w:t>
       </w:r>
     </w:p>
     <w:p>
@@ -67,7 +67,7 @@
         <w:spacing w:after="80"/>
       </w:pPr>
       <w:r>
-        <w:t>At the DNS provider for adesoafrica.org, add:</w:t>
+        <w:t>At the DNS provider for kuja.org, add:</w:t>
       </w:r>
     </w:p>
     <w:p>
@@ -82,7 +82,7 @@
         <w:t xml:space="preserve">Record 1 (routes the traffic):  </w:t>
       </w:r>
       <w:r>
-        <w:t>Type CNAME  ·  Name "proximate"  ·  Value "2483qpw6.up.railway.app"  ·  TTL 300</w:t>
+        <w:t>Type CNAME  ·  Name "proximate"  ·  Value "1zj8ev6l.up.railway.app"  ·  TTL 300</w:t>
       </w:r>
     </w:p>
     <w:p>
@@ -110,7 +110,7 @@
           <w:rFonts w:ascii="Consolas" w:hAnsi="Consolas"/>
           <w:sz w:val="18"/>
         </w:rPr>
-        <w:t>railway-verify=railway-verify=d1ea0bbcb17004deb6e5cc4c0c7103c01a408ddf768524859a3233b006466c90</w:t>
+        <w:t>railway-verify=railway-verify=d1510a5526b115edfbe2d1d752728da76dce403f758b46334a5b41710d545e2a</w:t>
       </w:r>
     </w:p>
     <w:p>
@@ -146,7 +146,7 @@
         <w:t xml:space="preserve">Open </w:t>
       </w:r>
       <w:r>
-        <w:t>https://proximate.adesoafrica.org — the login page should show the Proximate brand with Arabic as the default language, without selecting anything.</w:t>
+        <w:t>https://proximate.kuja.org — the login page should show the Proximate brand with Arabic as the default language, without selecting anything.</w:t>
       </w:r>
     </w:p>
     <w:p>
@@ -225,7 +225,7 @@
         <w:t xml:space="preserve">1. Email sending (highest impact). </w:t>
       </w:r>
       <w:r>
-        <w:t>Notifications — report reminders, retrospective notices, donor closing packs — are currently recorded in the system but not emailed, because no email provider is configured. Needed: a SendGrid API key set on the server, a sender address (noreply@adesoafrica.org), and SendGrid’s sender-verification DNS records — best added in the same DNS session as Step 1.</w:t>
+        <w:t>Notifications — report reminders, retrospective notices, donor closing packs — are currently recorded in the system but not emailed, because no email provider is configured. Needed: a SendGrid API key set on the server, a sender address (e.g. noreply@kuja.org), and SendGrid’s sender-verification DNS records — best added in the same DNS session as Step 1.</w:t>
       </w:r>
     </w:p>
     <w:p>
@@ -300,7 +300,7 @@
         <w:t xml:space="preserve">6. Optional. </w:t>
       </w:r>
       <w:r>
-        <w:t>proximate.kuja.org can be added as a second address later with the same two-record process on kuja.org.</w:t>
+        <w:t>proximate.adesoafrica.org (the earlier option, superseded by this decision) can be activated later with the same two-record process on adesoafrica.org, or removed from the Railway panel.</w:t>
       </w:r>
     </w:p>
     <w:p>

</xml_diff>